<commit_message>
Add program statement ROI and roadmap
</commit_message>
<xml_diff>
--- a/Product Docs/Submission/InvestigateIQ_Deck_Presenter_Guide.docx
+++ b/Product Docs/Submission/InvestigateIQ_Deck_Presenter_Guide.docx
@@ -361,7 +361,7 @@
                 <w:sz w:val="18"/>
                 <w:szCs w:val="18"/>
               </w:rPr>
-              <w:t xml:space="preserve">0:40</w:t>
+              <w:t xml:space="preserve">0:35</w:t>
             </w:r>
           </w:p>
         </w:tc>
@@ -498,7 +498,7 @@
                 <w:sz w:val="18"/>
                 <w:szCs w:val="18"/>
               </w:rPr>
-              <w:t xml:space="preserve">0:45</w:t>
+              <w:t xml:space="preserve">0:40</w:t>
             </w:r>
           </w:p>
         </w:tc>
@@ -554,7 +554,7 @@
                 <w:sz w:val="18"/>
                 <w:szCs w:val="18"/>
               </w:rPr>
-              <w:t xml:space="preserve">The problem</w:t>
+              <w:t xml:space="preserve">Program statement</w:t>
             </w:r>
           </w:p>
         </w:tc>
@@ -608,7 +608,7 @@
                 <w:sz w:val="18"/>
                 <w:szCs w:val="18"/>
               </w:rPr>
-              <w:t xml:space="preserve">Explain why a monitoring alert is not a conclusion.</w:t>
+              <w:t xml:space="preserve">State the capstone commitment, success measures, and non-goals before the product tour.</w:t>
             </w:r>
           </w:p>
         </w:tc>
@@ -691,7 +691,7 @@
                 <w:sz w:val="18"/>
                 <w:szCs w:val="18"/>
               </w:rPr>
-              <w:t xml:space="preserve">Product workflow</w:t>
+              <w:t xml:space="preserve">The problem</w:t>
             </w:r>
           </w:p>
         </w:tc>
@@ -745,7 +745,7 @@
                 <w:sz w:val="18"/>
                 <w:szCs w:val="18"/>
               </w:rPr>
-              <w:t xml:space="preserve">Walk through the one-case journey end to end.</w:t>
+              <w:t xml:space="preserve">Explain why a monitoring alert is not a conclusion.</w:t>
             </w:r>
           </w:p>
         </w:tc>
@@ -772,7 +772,7 @@
                 <w:sz w:val="18"/>
                 <w:szCs w:val="18"/>
               </w:rPr>
-              <w:t xml:space="preserve">0:55</w:t>
+              <w:t xml:space="preserve">0:40</w:t>
             </w:r>
           </w:p>
         </w:tc>
@@ -828,7 +828,7 @@
                 <w:sz w:val="18"/>
                 <w:szCs w:val="18"/>
               </w:rPr>
-              <w:t xml:space="preserve">Product navigation</w:t>
+              <w:t xml:space="preserve">Product workflow</w:t>
             </w:r>
           </w:p>
         </w:tc>
@@ -882,7 +882,7 @@
                 <w:sz w:val="18"/>
                 <w:szCs w:val="18"/>
               </w:rPr>
-              <w:t xml:space="preserve">Show that the left navigation follows the same work sequence.</w:t>
+              <w:t xml:space="preserve">Walk through the one-case journey end to end.</w:t>
             </w:r>
           </w:p>
         </w:tc>
@@ -909,7 +909,7 @@
                 <w:sz w:val="18"/>
                 <w:szCs w:val="18"/>
               </w:rPr>
-              <w:t xml:space="preserve">0:40</w:t>
+              <w:t xml:space="preserve">0:50</w:t>
             </w:r>
           </w:p>
         </w:tc>
@@ -965,7 +965,7 @@
                 <w:sz w:val="18"/>
                 <w:szCs w:val="18"/>
               </w:rPr>
-              <w:t xml:space="preserve">Case Queue</w:t>
+              <w:t xml:space="preserve">Product navigation</w:t>
             </w:r>
           </w:p>
         </w:tc>
@@ -1019,7 +1019,7 @@
                 <w:sz w:val="18"/>
                 <w:szCs w:val="18"/>
               </w:rPr>
-              <w:t xml:space="preserve">Explain filters and distinguish status, rules, and the action button.</w:t>
+              <w:t xml:space="preserve">Show that the left navigation follows the same work sequence.</w:t>
             </w:r>
           </w:p>
         </w:tc>
@@ -1046,7 +1046,7 @@
                 <w:sz w:val="18"/>
                 <w:szCs w:val="18"/>
               </w:rPr>
-              <w:t xml:space="preserve">1:05</w:t>
+              <w:t xml:space="preserve">0:35</w:t>
             </w:r>
           </w:p>
         </w:tc>
@@ -1102,7 +1102,7 @@
                 <w:sz w:val="18"/>
                 <w:szCs w:val="18"/>
               </w:rPr>
-              <w:t xml:space="preserve">Investigation Workspace</w:t>
+              <w:t xml:space="preserve">Case Queue</w:t>
             </w:r>
           </w:p>
         </w:tc>
@@ -1156,7 +1156,7 @@
                 <w:sz w:val="18"/>
                 <w:szCs w:val="18"/>
               </w:rPr>
-              <w:t xml:space="preserve">Explain the report modes, validator, and decision boundary.</w:t>
+              <w:t xml:space="preserve">Explain filters and distinguish status, rules, and the action button.</w:t>
             </w:r>
           </w:p>
         </w:tc>
@@ -1183,7 +1183,7 @@
                 <w:sz w:val="18"/>
                 <w:szCs w:val="18"/>
               </w:rPr>
-              <w:t xml:space="preserve">1:10</w:t>
+              <w:t xml:space="preserve">0:50</w:t>
             </w:r>
           </w:p>
         </w:tc>
@@ -1239,7 +1239,7 @@
                 <w:sz w:val="18"/>
                 <w:szCs w:val="18"/>
               </w:rPr>
-              <w:t xml:space="preserve">Evidence confidence</w:t>
+              <w:t xml:space="preserve">Investigation Workspace</w:t>
             </w:r>
           </w:p>
         </w:tc>
@@ -1293,7 +1293,7 @@
                 <w:sz w:val="18"/>
                 <w:szCs w:val="18"/>
               </w:rPr>
-              <w:t xml:space="preserve">Present the responsible-AI score with its limitations.</w:t>
+              <w:t xml:space="preserve">Explain the report modes, validator, and decision boundary.</w:t>
             </w:r>
           </w:p>
         </w:tc>
@@ -1320,7 +1320,7 @@
                 <w:sz w:val="18"/>
                 <w:szCs w:val="18"/>
               </w:rPr>
-              <w:t xml:space="preserve">0:55</w:t>
+              <w:t xml:space="preserve">1:00</w:t>
             </w:r>
           </w:p>
         </w:tc>
@@ -1376,7 +1376,7 @@
                 <w:sz w:val="18"/>
                 <w:szCs w:val="18"/>
               </w:rPr>
-              <w:t xml:space="preserve">OKF, chunks, and RAG</w:t>
+              <w:t xml:space="preserve">Evidence confidence</w:t>
             </w:r>
           </w:p>
         </w:tc>
@@ -1430,7 +1430,7 @@
                 <w:sz w:val="18"/>
                 <w:szCs w:val="18"/>
               </w:rPr>
-              <w:t xml:space="preserve">Explain the key coding logic behind source ingestion, retrieval, and citations.</w:t>
+              <w:t xml:space="preserve">Present the responsible-AI score with its limitations.</w:t>
             </w:r>
           </w:p>
         </w:tc>
@@ -1457,7 +1457,7 @@
                 <w:sz w:val="18"/>
                 <w:szCs w:val="18"/>
               </w:rPr>
-              <w:t xml:space="preserve">1:20</w:t>
+              <w:t xml:space="preserve">0:50</w:t>
             </w:r>
           </w:p>
         </w:tc>
@@ -1513,7 +1513,7 @@
                 <w:sz w:val="18"/>
                 <w:szCs w:val="18"/>
               </w:rPr>
-              <w:t xml:space="preserve">InvestigateIQ Copilot</w:t>
+              <w:t xml:space="preserve">OKF, chunks, and RAG</w:t>
             </w:r>
           </w:p>
         </w:tc>
@@ -1567,7 +1567,7 @@
                 <w:sz w:val="18"/>
                 <w:szCs w:val="18"/>
               </w:rPr>
-              <w:t xml:space="preserve">Show the Copilot’s limited, evidence-bound role.</w:t>
+              <w:t xml:space="preserve">Explain the key coding logic behind source ingestion, retrieval, and citations.</w:t>
             </w:r>
           </w:p>
         </w:tc>
@@ -1594,7 +1594,7 @@
                 <w:sz w:val="18"/>
                 <w:szCs w:val="18"/>
               </w:rPr>
-              <w:t xml:space="preserve">0:50</w:t>
+              <w:t xml:space="preserve">1:20</w:t>
             </w:r>
           </w:p>
         </w:tc>
@@ -1650,7 +1650,7 @@
                 <w:sz w:val="18"/>
                 <w:szCs w:val="18"/>
               </w:rPr>
-              <w:t xml:space="preserve">Human decisions and Compliance</w:t>
+              <w:t xml:space="preserve">InvestigateIQ Copilot</w:t>
             </w:r>
           </w:p>
         </w:tc>
@@ -1704,7 +1704,7 @@
                 <w:sz w:val="18"/>
                 <w:szCs w:val="18"/>
               </w:rPr>
-              <w:t xml:space="preserve">Explain append-only decisions and the three separate Compliance outcomes.</w:t>
+              <w:t xml:space="preserve">Show the Copilot’s limited, evidence-bound role.</w:t>
             </w:r>
           </w:p>
         </w:tc>
@@ -1731,7 +1731,7 @@
                 <w:sz w:val="18"/>
                 <w:szCs w:val="18"/>
               </w:rPr>
-              <w:t xml:space="preserve">1:05</w:t>
+              <w:t xml:space="preserve">0:40</w:t>
             </w:r>
           </w:p>
         </w:tc>
@@ -1787,7 +1787,7 @@
                 <w:sz w:val="18"/>
                 <w:szCs w:val="18"/>
               </w:rPr>
-              <w:t xml:space="preserve">Analytics</w:t>
+              <w:t xml:space="preserve">Human decisions and Compliance</w:t>
             </w:r>
           </w:p>
         </w:tc>
@@ -1841,7 +1841,7 @@
                 <w:sz w:val="18"/>
                 <w:szCs w:val="18"/>
               </w:rPr>
-              <w:t xml:space="preserve">Explain every graph as descriptive stored-data analysis.</w:t>
+              <w:t xml:space="preserve">Explain append-only decisions and the three separate Compliance outcomes.</w:t>
             </w:r>
           </w:p>
         </w:tc>
@@ -1924,7 +1924,7 @@
                 <w:sz w:val="18"/>
                 <w:szCs w:val="18"/>
               </w:rPr>
-              <w:t xml:space="preserve">Context and ownership</w:t>
+              <w:t xml:space="preserve">Analytics</w:t>
             </w:r>
           </w:p>
         </w:tc>
@@ -1978,7 +1978,7 @@
                 <w:sz w:val="18"/>
                 <w:szCs w:val="18"/>
               </w:rPr>
-              <w:t xml:space="preserve">Explain Global Search and the role guide.</w:t>
+              <w:t xml:space="preserve">Explain every graph as descriptive stored-data analysis.</w:t>
             </w:r>
           </w:p>
         </w:tc>
@@ -2005,7 +2005,7 @@
                 <w:sz w:val="18"/>
                 <w:szCs w:val="18"/>
               </w:rPr>
-              <w:t xml:space="preserve">0:40</w:t>
+              <w:t xml:space="preserve">0:55</w:t>
             </w:r>
           </w:p>
         </w:tc>
@@ -2061,7 +2061,7 @@
                 <w:sz w:val="18"/>
                 <w:szCs w:val="18"/>
               </w:rPr>
-              <w:t xml:space="preserve">Technical architecture and code logic</w:t>
+              <w:t xml:space="preserve">Context and ownership</w:t>
             </w:r>
           </w:p>
         </w:tc>
@@ -2115,7 +2115,7 @@
                 <w:sz w:val="18"/>
                 <w:szCs w:val="18"/>
               </w:rPr>
-              <w:t xml:space="preserve">Connect the page experience to the actual implementation layers.</w:t>
+              <w:t xml:space="preserve">Explain Global Search and the role guide.</w:t>
             </w:r>
           </w:p>
         </w:tc>
@@ -2142,7 +2142,7 @@
                 <w:sz w:val="18"/>
                 <w:szCs w:val="18"/>
               </w:rPr>
-              <w:t xml:space="preserve">1:20</w:t>
+              <w:t xml:space="preserve">0:35</w:t>
             </w:r>
           </w:p>
         </w:tc>
@@ -2198,7 +2198,7 @@
                 <w:sz w:val="18"/>
                 <w:szCs w:val="18"/>
               </w:rPr>
-              <w:t xml:space="preserve">Protected administration</w:t>
+              <w:t xml:space="preserve">Technical architecture and code logic</w:t>
             </w:r>
           </w:p>
         </w:tc>
@@ -2252,7 +2252,7 @@
                 <w:sz w:val="18"/>
                 <w:szCs w:val="18"/>
               </w:rPr>
-              <w:t xml:space="preserve">Show the protected boundary without demonstrating the passcode.</w:t>
+              <w:t xml:space="preserve">Connect the page experience to the actual implementation layers.</w:t>
             </w:r>
           </w:p>
         </w:tc>
@@ -2279,7 +2279,7 @@
                 <w:sz w:val="18"/>
                 <w:szCs w:val="18"/>
               </w:rPr>
-              <w:t xml:space="preserve">0:40</w:t>
+              <w:t xml:space="preserve">1:10</w:t>
             </w:r>
           </w:p>
         </w:tc>
@@ -2335,7 +2335,7 @@
                 <w:sz w:val="18"/>
                 <w:szCs w:val="18"/>
               </w:rPr>
-              <w:t xml:space="preserve">Validation and deployment</w:t>
+              <w:t xml:space="preserve">Protected administration</w:t>
             </w:r>
           </w:p>
         </w:tc>
@@ -2389,7 +2389,7 @@
                 <w:sz w:val="18"/>
                 <w:szCs w:val="18"/>
               </w:rPr>
-              <w:t xml:space="preserve">Summarize how changes are checked and released.</w:t>
+              <w:t xml:space="preserve">Show the protected boundary without demonstrating the passcode.</w:t>
             </w:r>
           </w:p>
         </w:tc>
@@ -2416,7 +2416,7 @@
                 <w:sz w:val="18"/>
                 <w:szCs w:val="18"/>
               </w:rPr>
-              <w:t xml:space="preserve">0:45</w:t>
+              <w:t xml:space="preserve">0:35</w:t>
             </w:r>
           </w:p>
         </w:tc>
@@ -2472,6 +2472,280 @@
                 <w:sz w:val="18"/>
                 <w:szCs w:val="18"/>
               </w:rPr>
+              <w:t xml:space="preserve">Validation and deployment</w:t>
+            </w:r>
+          </w:p>
+        </w:tc>
+        <w:tc>
+          <w:tcPr>
+            <w:tcW w:type="dxa" w:w="1700"/>
+            <w:tcMar>
+              <w:top w:type="dxa" w:w="80"/>
+              <w:left w:type="dxa" w:w="100"/>
+              <w:bottom w:type="dxa" w:w="80"/>
+              <w:right w:type="dxa" w:w="100"/>
+            </w:tcMar>
+          </w:tcPr>
+          <w:p>
+            <w:pPr>
+              <w:spacing w:after="130" w:before="0" w:line="276"/>
+            </w:pPr>
+            <w:r>
+              <w:rPr>
+                <w:rFonts w:ascii="Arial" w:cs="Arial" w:eastAsia="Arial" w:hAnsi="Arial"/>
+                <w:b w:val="false"/>
+                <w:bCs w:val="false"/>
+                <w:color w:val="12233F"/>
+                <w:sz w:val="18"/>
+                <w:szCs w:val="18"/>
+              </w:rPr>
+              <w:t xml:space="preserve">Pankaj Bharsakale</w:t>
+            </w:r>
+          </w:p>
+        </w:tc>
+        <w:tc>
+          <w:tcPr>
+            <w:tcW w:type="dxa" w:w="4300"/>
+            <w:tcMar>
+              <w:top w:type="dxa" w:w="80"/>
+              <w:left w:type="dxa" w:w="100"/>
+              <w:bottom w:type="dxa" w:w="80"/>
+              <w:right w:type="dxa" w:w="100"/>
+            </w:tcMar>
+          </w:tcPr>
+          <w:p>
+            <w:pPr>
+              <w:spacing w:after="130" w:before="0" w:line="276"/>
+            </w:pPr>
+            <w:r>
+              <w:rPr>
+                <w:rFonts w:ascii="Arial" w:cs="Arial" w:eastAsia="Arial" w:hAnsi="Arial"/>
+                <w:b w:val="false"/>
+                <w:bCs w:val="false"/>
+                <w:color w:val="12233F"/>
+                <w:sz w:val="18"/>
+                <w:szCs w:val="18"/>
+              </w:rPr>
+              <w:t xml:space="preserve">Summarize how changes are checked and released.</w:t>
+            </w:r>
+          </w:p>
+        </w:tc>
+        <w:tc>
+          <w:tcPr>
+            <w:tcW w:type="dxa" w:w="1040"/>
+            <w:tcMar>
+              <w:top w:type="dxa" w:w="80"/>
+              <w:left w:type="dxa" w:w="100"/>
+              <w:bottom w:type="dxa" w:w="80"/>
+              <w:right w:type="dxa" w:w="100"/>
+            </w:tcMar>
+          </w:tcPr>
+          <w:p>
+            <w:pPr>
+              <w:spacing w:after="130" w:before="0" w:line="276"/>
+            </w:pPr>
+            <w:r>
+              <w:rPr>
+                <w:rFonts w:ascii="Arial" w:cs="Arial" w:eastAsia="Arial" w:hAnsi="Arial"/>
+                <w:b w:val="false"/>
+                <w:bCs w:val="false"/>
+                <w:color w:val="12233F"/>
+                <w:sz w:val="18"/>
+                <w:szCs w:val="18"/>
+              </w:rPr>
+              <w:t xml:space="preserve">0:45</w:t>
+            </w:r>
+          </w:p>
+        </w:tc>
+      </w:tr>
+      <w:tr>
+        <w:tc>
+          <w:tcPr>
+            <w:tcW w:type="dxa" w:w="520"/>
+            <w:tcMar>
+              <w:top w:type="dxa" w:w="80"/>
+              <w:left w:type="dxa" w:w="100"/>
+              <w:bottom w:type="dxa" w:w="80"/>
+              <w:right w:type="dxa" w:w="100"/>
+            </w:tcMar>
+          </w:tcPr>
+          <w:p>
+            <w:pPr>
+              <w:spacing w:after="130" w:before="0" w:line="276"/>
+            </w:pPr>
+            <w:r>
+              <w:rPr>
+                <w:rFonts w:ascii="Arial" w:cs="Arial" w:eastAsia="Arial" w:hAnsi="Arial"/>
+                <w:b w:val="false"/>
+                <w:bCs w:val="false"/>
+                <w:color w:val="12233F"/>
+                <w:sz w:val="18"/>
+                <w:szCs w:val="18"/>
+              </w:rPr>
+              <w:t xml:space="preserve">18</w:t>
+            </w:r>
+          </w:p>
+        </w:tc>
+        <w:tc>
+          <w:tcPr>
+            <w:tcW w:type="dxa" w:w="1800"/>
+            <w:tcMar>
+              <w:top w:type="dxa" w:w="80"/>
+              <w:left w:type="dxa" w:w="100"/>
+              <w:bottom w:type="dxa" w:w="80"/>
+              <w:right w:type="dxa" w:w="100"/>
+            </w:tcMar>
+          </w:tcPr>
+          <w:p>
+            <w:pPr>
+              <w:spacing w:after="130" w:before="0" w:line="276"/>
+            </w:pPr>
+            <w:r>
+              <w:rPr>
+                <w:rFonts w:ascii="Arial" w:cs="Arial" w:eastAsia="Arial" w:hAnsi="Arial"/>
+                <w:b w:val="false"/>
+                <w:bCs w:val="false"/>
+                <w:color w:val="12233F"/>
+                <w:sz w:val="18"/>
+                <w:szCs w:val="18"/>
+              </w:rPr>
+              <w:t xml:space="preserve">Value realization, ROI, and roadmap</w:t>
+            </w:r>
+          </w:p>
+        </w:tc>
+        <w:tc>
+          <w:tcPr>
+            <w:tcW w:type="dxa" w:w="1700"/>
+            <w:tcMar>
+              <w:top w:type="dxa" w:w="80"/>
+              <w:left w:type="dxa" w:w="100"/>
+              <w:bottom w:type="dxa" w:w="80"/>
+              <w:right w:type="dxa" w:w="100"/>
+            </w:tcMar>
+          </w:tcPr>
+          <w:p>
+            <w:pPr>
+              <w:spacing w:after="130" w:before="0" w:line="276"/>
+            </w:pPr>
+            <w:r>
+              <w:rPr>
+                <w:rFonts w:ascii="Arial" w:cs="Arial" w:eastAsia="Arial" w:hAnsi="Arial"/>
+                <w:b w:val="false"/>
+                <w:bCs w:val="false"/>
+                <w:color w:val="12233F"/>
+                <w:sz w:val="18"/>
+                <w:szCs w:val="18"/>
+              </w:rPr>
+              <w:t xml:space="preserve">Pankaj Bharsakale</w:t>
+            </w:r>
+          </w:p>
+        </w:tc>
+        <w:tc>
+          <w:tcPr>
+            <w:tcW w:type="dxa" w:w="4300"/>
+            <w:tcMar>
+              <w:top w:type="dxa" w:w="80"/>
+              <w:left w:type="dxa" w:w="100"/>
+              <w:bottom w:type="dxa" w:w="80"/>
+              <w:right w:type="dxa" w:w="100"/>
+            </w:tcMar>
+          </w:tcPr>
+          <w:p>
+            <w:pPr>
+              <w:spacing w:after="130" w:before="0" w:line="276"/>
+            </w:pPr>
+            <w:r>
+              <w:rPr>
+                <w:rFonts w:ascii="Arial" w:cs="Arial" w:eastAsia="Arial" w:hAnsi="Arial"/>
+                <w:b w:val="false"/>
+                <w:bCs w:val="false"/>
+                <w:color w:val="12233F"/>
+                <w:sz w:val="18"/>
+                <w:szCs w:val="18"/>
+              </w:rPr>
+              <w:t xml:space="preserve">Present a measurable ROI planning model and the future roadmap without claiming a financial result from fictional data.</w:t>
+            </w:r>
+          </w:p>
+        </w:tc>
+        <w:tc>
+          <w:tcPr>
+            <w:tcW w:type="dxa" w:w="1040"/>
+            <w:tcMar>
+              <w:top w:type="dxa" w:w="80"/>
+              <w:left w:type="dxa" w:w="100"/>
+              <w:bottom w:type="dxa" w:w="80"/>
+              <w:right w:type="dxa" w:w="100"/>
+            </w:tcMar>
+          </w:tcPr>
+          <w:p>
+            <w:pPr>
+              <w:spacing w:after="130" w:before="0" w:line="276"/>
+            </w:pPr>
+            <w:r>
+              <w:rPr>
+                <w:rFonts w:ascii="Arial" w:cs="Arial" w:eastAsia="Arial" w:hAnsi="Arial"/>
+                <w:b w:val="false"/>
+                <w:bCs w:val="false"/>
+                <w:color w:val="12233F"/>
+                <w:sz w:val="18"/>
+                <w:szCs w:val="18"/>
+              </w:rPr>
+              <w:t xml:space="preserve">0:45</w:t>
+            </w:r>
+          </w:p>
+        </w:tc>
+      </w:tr>
+      <w:tr>
+        <w:tc>
+          <w:tcPr>
+            <w:tcW w:type="dxa" w:w="520"/>
+            <w:tcMar>
+              <w:top w:type="dxa" w:w="80"/>
+              <w:left w:type="dxa" w:w="100"/>
+              <w:bottom w:type="dxa" w:w="80"/>
+              <w:right w:type="dxa" w:w="100"/>
+            </w:tcMar>
+          </w:tcPr>
+          <w:p>
+            <w:pPr>
+              <w:spacing w:after="130" w:before="0" w:line="276"/>
+            </w:pPr>
+            <w:r>
+              <w:rPr>
+                <w:rFonts w:ascii="Arial" w:cs="Arial" w:eastAsia="Arial" w:hAnsi="Arial"/>
+                <w:b w:val="false"/>
+                <w:bCs w:val="false"/>
+                <w:color w:val="12233F"/>
+                <w:sz w:val="18"/>
+                <w:szCs w:val="18"/>
+              </w:rPr>
+              <w:t xml:space="preserve">19</w:t>
+            </w:r>
+          </w:p>
+        </w:tc>
+        <w:tc>
+          <w:tcPr>
+            <w:tcW w:type="dxa" w:w="1800"/>
+            <w:tcMar>
+              <w:top w:type="dxa" w:w="80"/>
+              <w:left w:type="dxa" w:w="100"/>
+              <w:bottom w:type="dxa" w:w="80"/>
+              <w:right w:type="dxa" w:w="100"/>
+            </w:tcMar>
+          </w:tcPr>
+          <w:p>
+            <w:pPr>
+              <w:spacing w:after="130" w:before="0" w:line="276"/>
+            </w:pPr>
+            <w:r>
+              <w:rPr>
+                <w:rFonts w:ascii="Arial" w:cs="Arial" w:eastAsia="Arial" w:hAnsi="Arial"/>
+                <w:b w:val="false"/>
+                <w:bCs w:val="false"/>
+                <w:color w:val="12233F"/>
+                <w:sz w:val="18"/>
+                <w:szCs w:val="18"/>
+              </w:rPr>
               <w:t xml:space="preserve">Closing</w:t>
             </w:r>
           </w:p>
@@ -2553,7 +2827,7 @@
                 <w:sz w:val="18"/>
                 <w:szCs w:val="18"/>
               </w:rPr>
-              <w:t xml:space="preserve">0:25</w:t>
+              <w:t xml:space="preserve">0:30</w:t>
             </w:r>
           </w:p>
         </w:tc>
@@ -2590,7 +2864,7 @@
           <w:sz w:val="24"/>
           <w:szCs w:val="24"/>
         </w:rPr>
-        <w:t xml:space="preserve">1. InvestigateIQ — 0:40</w:t>
+        <w:t xml:space="preserve">1. InvestigateIQ — 0:35</w:t>
       </w:r>
     </w:p>
     <w:p>
@@ -2655,7 +2929,7 @@
           <w:sz w:val="24"/>
           <w:szCs w:val="24"/>
         </w:rPr>
-        <w:t xml:space="preserve">2. Project team — 0:45</w:t>
+        <w:t xml:space="preserve">2. Project team — 0:40</w:t>
       </w:r>
     </w:p>
     <w:p>
@@ -2720,7 +2994,7 @@
           <w:sz w:val="24"/>
           <w:szCs w:val="24"/>
         </w:rPr>
-        <w:t xml:space="preserve">3. The problem — 0:45</w:t>
+        <w:t xml:space="preserve">3. Program statement — 0:45</w:t>
       </w:r>
     </w:p>
     <w:p>
@@ -2736,7 +3010,7 @@
           <w:sz w:val="19"/>
           <w:szCs w:val="19"/>
         </w:rPr>
-        <w:t xml:space="preserve">Pankaj says: “A monitoring alert can prioritize a review, but it does not by itself prove wrongdoing. An investigator still needs the underlying records, a clear view of missing evidence, and a reasoned next action. InvestigateIQ connects those pieces instead of presenting an alert as a verdict.”</w:t>
+        <w:t xml:space="preserve">Pankaj says: “Our program statement is simple: we are designing and demonstrating a transparent, AI-assisted workflow for fictional AML case review. Every report claim should be traceable to supplied material, every limitation should be visible, and every workflow action must remain a named human decision. We measure success through traceability, clear states, visible gaps, and required rationale—not automated outcomes.”</w:t>
       </w:r>
     </w:p>
     <w:p>
@@ -2752,7 +3026,7 @@
           <w:sz w:val="18"/>
           <w:szCs w:val="18"/>
         </w:rPr>
-        <w:t xml:space="preserve">Pointer and pacing: Point first to the alert metadata items, then to the Case Queue image.</w:t>
+        <w:t xml:space="preserve">Pointer and pacing: Hold the pointer on the central Program Statement, then move through Problem, Program outcome, Success measures, and Non-goals.</w:t>
       </w:r>
     </w:p>
     <w:p>
@@ -2768,7 +3042,7 @@
           <w:sz w:val="18"/>
           <w:szCs w:val="18"/>
         </w:rPr>
-        <w:t xml:space="preserve">Rahul prepares: Do not call any fictional alert suspicious, illegal, or confirmed. Say ‘needs review’ or ‘requires human assessment.’</w:t>
+        <w:t xml:space="preserve">Rahul prepares: Do not shorten the program statement to an AI claim. Read the non-goals: no real data, autonomous action, legal conclusion, or external filing.</w:t>
       </w:r>
     </w:p>
     <w:p>
@@ -2785,7 +3059,7 @@
           <w:sz w:val="24"/>
           <w:szCs w:val="24"/>
         </w:rPr>
-        <w:t xml:space="preserve">4. Product workflow — 0:55</w:t>
+        <w:t xml:space="preserve">4. The problem — 0:40</w:t>
       </w:r>
     </w:p>
     <w:p>
@@ -2801,7 +3075,7 @@
           <w:sz w:val="19"/>
           <w:szCs w:val="19"/>
         </w:rPr>
-        <w:t xml:space="preserve">Pankaj says: “We follow one visible workflow. First, an investigator finds a case in the queue. Next, the workspace builds or replays a report. Then Evidence and RAG opens the exact stored material behind the report. A named person records a rationale, and Compliance can perform a separate second review. The system never closes, escalates, refers, or files an action automatically.”</w:t>
+        <w:t xml:space="preserve">Pankaj says: “A monitoring alert can prioritize a review, but it does not by itself prove wrongdoing. An investigator still needs the underlying records, a clear view of missing evidence, and a reasoned next action. InvestigateIQ connects those pieces instead of presenting an alert as a verdict.”</w:t>
       </w:r>
     </w:p>
     <w:p>
@@ -2817,7 +3091,7 @@
           <w:sz w:val="18"/>
           <w:szCs w:val="18"/>
         </w:rPr>
-        <w:t xml:space="preserve">Pointer and pacing: Reveal or point to the five steps from left to right, pausing briefly on Evidence &amp; RAG and Human action.</w:t>
+        <w:t xml:space="preserve">Pointer and pacing: Point first to the alert metadata items, then to the Case Queue image.</w:t>
       </w:r>
     </w:p>
     <w:p>
@@ -2833,7 +3107,7 @@
           <w:sz w:val="18"/>
           <w:szCs w:val="18"/>
         </w:rPr>
-        <w:t xml:space="preserve">Rahul prepares: Let the fade transition complete before speaking to each stage. Keep the pointer on the stage being named.</w:t>
+        <w:t xml:space="preserve">Rahul prepares: Do not call any fictional alert suspicious, illegal, or confirmed. Say ‘needs review’ or ‘requires human assessment.’</w:t>
       </w:r>
     </w:p>
     <w:p>
@@ -2850,7 +3124,7 @@
           <w:sz w:val="24"/>
           <w:szCs w:val="24"/>
         </w:rPr>
-        <w:t xml:space="preserve">5. Product navigation — 0:40</w:t>
+        <w:t xml:space="preserve">5. Product workflow — 0:50</w:t>
       </w:r>
     </w:p>
     <w:p>
@@ -2866,7 +3140,7 @@
           <w:sz w:val="19"/>
           <w:szCs w:val="19"/>
         </w:rPr>
-        <w:t xml:space="preserve">Pankaj says: “The reordered navigation mirrors the investigation sequence. We begin with the Home and Case Queue pages, move into the Investigation Workspace, then use Evidence and RAG to inspect support. Compliance, Analytics, and Global Search serve the later review and context steps. This reduces unnecessary navigation during an investigation.”</w:t>
+        <w:t xml:space="preserve">Pankaj says: “We follow one visible workflow. First, an investigator finds a case in the queue. Next, the workspace builds or replays a report. Then Evidence and RAG opens the exact stored material behind the report. A named person records a rationale, and Compliance can perform a separate second review. The system never closes, escalates, refers, or files an action automatically.”</w:t>
       </w:r>
     </w:p>
     <w:p>
@@ -2882,7 +3156,7 @@
           <w:sz w:val="18"/>
           <w:szCs w:val="18"/>
         </w:rPr>
-        <w:t xml:space="preserve">Pointer and pacing: Trace only the core workspaces on the right-side list; do not wave across the screenshot.</w:t>
+        <w:t xml:space="preserve">Pointer and pacing: Reveal or point to the five steps from left to right, pausing briefly on Evidence &amp; RAG and Human action.</w:t>
       </w:r>
     </w:p>
     <w:p>
@@ -2898,7 +3172,7 @@
           <w:sz w:val="18"/>
           <w:szCs w:val="18"/>
         </w:rPr>
-        <w:t xml:space="preserve">Rahul prepares: Mention that Admin screens are deliberately separated from normal review work.</w:t>
+        <w:t xml:space="preserve">Rahul prepares: Let the fade transition complete before speaking to each stage. Keep the pointer on the stage being named.</w:t>
       </w:r>
     </w:p>
     <w:p>
@@ -2915,7 +3189,7 @@
           <w:sz w:val="24"/>
           <w:szCs w:val="24"/>
         </w:rPr>
-        <w:t xml:space="preserve">6. Case Queue — 1:05</w:t>
+        <w:t xml:space="preserve">6. Product navigation — 0:35</w:t>
       </w:r>
     </w:p>
     <w:p>
@@ -2931,7 +3205,7 @@
           <w:sz w:val="19"/>
           <w:szCs w:val="19"/>
         </w:rPr>
-        <w:t xml:space="preserve">Pankaj says: “The Case Queue turns stored fictional alerts into a manageable workload. Filters narrow the queue by customer, status, severity, and scenario. In each row, severity is a priority label, status shows where the case is in the workflow, and Rule(s) records the trigger metadata. The action opens a current case or, for a completed case, lets us inspect the supporting evidence rather than reopening a decision.”</w:t>
+        <w:t xml:space="preserve">Pankaj says: “The reordered navigation mirrors the investigation sequence. We begin with the Home and Case Queue pages, move into the Investigation Workspace, then use Evidence and RAG to inspect support. Compliance, Analytics, and Global Search serve the later review and context steps. This reduces unnecessary navigation during an investigation.”</w:t>
       </w:r>
     </w:p>
     <w:p>
@@ -2947,7 +3221,7 @@
           <w:sz w:val="18"/>
           <w:szCs w:val="18"/>
         </w:rPr>
-        <w:t xml:space="preserve">Pointer and pacing: Point to the filters, then follow one row across Severity, Status, Rule(s), and Action.</w:t>
+        <w:t xml:space="preserve">Pointer and pacing: Trace only the core workspaces on the right-side list; do not wave across the screenshot.</w:t>
       </w:r>
     </w:p>
     <w:p>
@@ -2963,7 +3237,7 @@
           <w:sz w:val="18"/>
           <w:szCs w:val="18"/>
         </w:rPr>
-        <w:t xml:space="preserve">Rahul prepares: Use one row only. State that ‘source closed’ is not the same as a human closure or a Compliance outcome.</w:t>
+        <w:t xml:space="preserve">Rahul prepares: Mention that Admin screens are deliberately separated from normal review work.</w:t>
       </w:r>
     </w:p>
     <w:p>
@@ -2980,7 +3254,7 @@
           <w:sz w:val="24"/>
           <w:szCs w:val="24"/>
         </w:rPr>
-        <w:t xml:space="preserve">7. Investigation Workspace — 1:10</w:t>
+        <w:t xml:space="preserve">7. Case Queue — 0:50</w:t>
       </w:r>
     </w:p>
     <w:p>
@@ -2996,7 +3270,7 @@
           <w:sz w:val="19"/>
           <w:szCs w:val="19"/>
         </w:rPr>
-        <w:t xml:space="preserve">Pankaj says: “The Investigation Workspace is where the reviewer reads the case report. A saved report replays a historical snapshot for a repeatable demonstration. Calculated mode recomputes from the current stored fictional rows. The validator surfaces notes before a decision, but running or replaying a report never records a decision by itself. The human remains responsible for the next action.”</w:t>
+        <w:t xml:space="preserve">Pankaj says: “The Case Queue turns stored fictional alerts into a manageable workload. Filters narrow the queue by customer, status, severity, and scenario. In each row, severity is a priority label, status shows where the case is in the workflow, and Rule(s) records the trigger metadata. The action opens a current case or, for a completed case, lets us inspect the supporting evidence rather than reopening a decision.”</w:t>
       </w:r>
     </w:p>
     <w:p>
@@ -3012,7 +3286,7 @@
           <w:sz w:val="18"/>
           <w:szCs w:val="18"/>
         </w:rPr>
-        <w:t xml:space="preserve">Pointer and pacing: Point to Saved report, Calculated mode, and Validator in that order.</w:t>
+        <w:t xml:space="preserve">Pointer and pacing: Point to the filters, then follow one row across Severity, Status, Rule(s), and Action.</w:t>
       </w:r>
     </w:p>
     <w:p>
@@ -3028,7 +3302,7 @@
           <w:sz w:val="18"/>
           <w:szCs w:val="18"/>
         </w:rPr>
-        <w:t xml:space="preserve">Rahul prepares: Do not call a calculated result an AI decision. If asked, explain that the optional AI draft remains advisory and is checked against available material.</w:t>
+        <w:t xml:space="preserve">Rahul prepares: Use one row only. State that ‘source closed’ is not the same as a human closure or a Compliance outcome.</w:t>
       </w:r>
     </w:p>
     <w:p>
@@ -3045,7 +3319,7 @@
           <w:sz w:val="24"/>
           <w:szCs w:val="24"/>
         </w:rPr>
-        <w:t xml:space="preserve">8. Evidence confidence — 0:55</w:t>
+        <w:t xml:space="preserve">8. Investigation Workspace — 1:00</w:t>
       </w:r>
     </w:p>
     <w:p>
@@ -3061,7 +3335,7 @@
           <w:sz w:val="19"/>
           <w:szCs w:val="19"/>
         </w:rPr>
-        <w:t xml:space="preserve">Pankaj says: “After a report is available, the product shows evidence confidence. This is a deterministic support-coverage indicator: it summarizes how well the supplied records and guidance support the displayed draft, and it exposes known limitations. It is not a probability of crime, legality, money laundering, or the correct case outcome. The score is a prompt for human review, not an automated recommendation.”</w:t>
+        <w:t xml:space="preserve">Pankaj says: “The Investigation Workspace is where the reviewer reads the case report. A saved report replays a historical snapshot for a repeatable demonstration. Calculated mode recomputes from the current stored fictional rows. The validator surfaces notes before a decision, but running or replaying a report never records a decision by itself. The human remains responsible for the next action.”</w:t>
       </w:r>
     </w:p>
     <w:p>
@@ -3077,7 +3351,7 @@
           <w:sz w:val="18"/>
           <w:szCs w:val="18"/>
         </w:rPr>
-        <w:t xml:space="preserve">Pointer and pacing: Point to the score, then Coverage, Limitations, and Boundary—one at a time.</w:t>
+        <w:t xml:space="preserve">Pointer and pacing: Point to Saved report, Calculated mode, and Validator in that order.</w:t>
       </w:r>
     </w:p>
     <w:p>
@@ -3093,7 +3367,7 @@
           <w:sz w:val="18"/>
           <w:szCs w:val="18"/>
         </w:rPr>
-        <w:t xml:space="preserve">Rahul prepares: Say ‘support coverage’ every time; never shorten it to ‘risk score.’</w:t>
+        <w:t xml:space="preserve">Rahul prepares: Do not call a calculated result an AI decision. If asked, explain that the optional AI draft remains advisory and is checked against available material.</w:t>
       </w:r>
     </w:p>
     <w:p>
@@ -3110,7 +3384,7 @@
           <w:sz w:val="24"/>
           <w:szCs w:val="24"/>
         </w:rPr>
-        <w:t xml:space="preserve">9. OKF, chunks, and RAG — 1:20</w:t>
+        <w:t xml:space="preserve">9. Evidence confidence — 0:50</w:t>
       </w:r>
     </w:p>
     <w:p>
@@ -3126,7 +3400,7 @@
           <w:sz w:val="19"/>
           <w:szCs w:val="19"/>
         </w:rPr>
-        <w:t xml:space="preserve">Pankaj says: “This is the core evidence-retrieval logic. Our OKF, or Open Knowledge Format, keeps a synthetic source ID, scenario, title, criteria, and body text together. The ingestion code creates a metadata chunk, called C0, and then small body chunks of about two sentences. SQLite FTS5 performs a local keyword search, BM25 ranks the matching chunks, and the retrieved chunk IDs become the context for a cited answer. The reviewer can open the exact passage. Retrieval helps find text; it does not prove that the text is true or that an alert is wrongdoing.”</w:t>
+        <w:t xml:space="preserve">Pankaj says: “After a report is available, the product shows evidence confidence. This is a deterministic support-coverage indicator: it summarizes how well the supplied records and guidance support the displayed draft, and it exposes known limitations. It is not a probability of crime, legality, money laundering, or the correct case outcome. The score is a prompt for human review, not an automated recommendation.”</w:t>
       </w:r>
     </w:p>
     <w:p>
@@ -3142,7 +3416,7 @@
           <w:sz w:val="18"/>
           <w:szCs w:val="18"/>
         </w:rPr>
-        <w:t xml:space="preserve">Pointer and pacing: Point to the source chunks screenshot on the left while describing steps 1–2; then point to Index and RAG review on the right and finally the code-flow strip.</w:t>
+        <w:t xml:space="preserve">Pointer and pacing: Point to the score, then Coverage, Limitations, and Boundary—one at a time.</w:t>
       </w:r>
     </w:p>
     <w:p>
@@ -3158,7 +3432,7 @@
           <w:sz w:val="18"/>
           <w:szCs w:val="18"/>
         </w:rPr>
-        <w:t xml:space="preserve">Rahul prepares: Be ready to define FTS5 as SQLite full-text search and BM25 as the ranking method for keyword matches. Use ‘RAG’—retrieval-augmented generation—not ‘REG.’</w:t>
+        <w:t xml:space="preserve">Rahul prepares: Say ‘support coverage’ every time; never shorten it to ‘risk score.’</w:t>
       </w:r>
     </w:p>
     <w:p>
@@ -3175,7 +3449,7 @@
           <w:sz w:val="24"/>
           <w:szCs w:val="24"/>
         </w:rPr>
-        <w:t xml:space="preserve">10. InvestigateIQ Copilot — 0:50</w:t>
+        <w:t xml:space="preserve">10. OKF, chunks, and RAG — 1:20</w:t>
       </w:r>
     </w:p>
     <w:p>
@@ -3191,7 +3465,7 @@
           <w:sz w:val="19"/>
           <w:szCs w:val="19"/>
         </w:rPr>
-        <w:t xml:space="preserve">Pankaj says: “The InvestigateIQ Copilot can summarize the stored fictional records, cite source IDs and evidence gaps, and explain the selected case context. It remains bounded by the available material. It cannot verify an outside document, decide that funds are lawful or unlawful, or submit or change a human decision.”</w:t>
+        <w:t xml:space="preserve">Pankaj says: “This is the core evidence-retrieval logic. Our OKF, or Open Knowledge Format, keeps a synthetic source ID, scenario, title, criteria, and body text together. The ingestion code creates a metadata chunk, called C0, and then small body chunks of about two sentences. SQLite FTS5 performs a local keyword search, BM25 ranks the matching chunks, and the retrieved chunk IDs become the context for a cited answer. The reviewer can open the exact passage. Retrieval helps find text; it does not prove that the text is true or that an alert is wrongdoing.”</w:t>
       </w:r>
     </w:p>
     <w:p>
@@ -3207,7 +3481,7 @@
           <w:sz w:val="18"/>
           <w:szCs w:val="18"/>
         </w:rPr>
-        <w:t xml:space="preserve">Pointer and pacing: Point to the three allowed capabilities, then the sentence that it cannot submit or alter a decision.</w:t>
+        <w:t xml:space="preserve">Pointer and pacing: Point to the source chunks screenshot on the left while describing steps 1–2; then point to Index and RAG review on the right and finally the code-flow strip.</w:t>
       </w:r>
     </w:p>
     <w:p>
@@ -3223,7 +3497,7 @@
           <w:sz w:val="18"/>
           <w:szCs w:val="18"/>
         </w:rPr>
-        <w:t xml:space="preserve">Rahul prepares: Keep the explanation short; the detailed retrieval logic was already covered on the previous slide.</w:t>
+        <w:t xml:space="preserve">Rahul prepares: Be ready to define FTS5 as SQLite full-text search and BM25 as the ranking method for keyword matches. Use ‘RAG’—retrieval-augmented generation—not ‘REG.’</w:t>
       </w:r>
     </w:p>
     <w:p>
@@ -3240,7 +3514,7 @@
           <w:sz w:val="24"/>
           <w:szCs w:val="24"/>
         </w:rPr>
-        <w:t xml:space="preserve">11. Human decisions and Compliance — 1:05</w:t>
+        <w:t xml:space="preserve">11. InvestigateIQ Copilot — 0:40</w:t>
       </w:r>
     </w:p>
     <w:p>
@@ -3256,7 +3530,7 @@
           <w:sz w:val="19"/>
           <w:szCs w:val="19"/>
         </w:rPr>
-        <w:t xml:space="preserve">Pankaj says: “A decision becomes an accountable audit event only when a named investigator selects an allowed action and records a rationale. The completed form becomes a recorded state rather than being silently editable. Compliance is a separate human review. It can acknowledge with no further action, return the case for more information, or record an onward referral. Each result maps to a distinct queue state and audit history. The tool does not file externally.”</w:t>
+        <w:t xml:space="preserve">Pankaj says: “The InvestigateIQ Copilot can summarize the stored fictional records, cite source IDs and evidence gaps, and explain the selected case context. It remains bounded by the available material. It cannot verify an outside document, decide that funds are lawful or unlawful, or submit or change a human decision.”</w:t>
       </w:r>
     </w:p>
     <w:p>
@@ -3272,7 +3546,7 @@
           <w:sz w:val="18"/>
           <w:szCs w:val="18"/>
         </w:rPr>
-        <w:t xml:space="preserve">Pointer and pacing: Point first to Investigator, then Compliance Officer, then the no-automation statement.</w:t>
+        <w:t xml:space="preserve">Pointer and pacing: Point to the three allowed capabilities, then the sentence that it cannot submit or alter a decision.</w:t>
       </w:r>
     </w:p>
     <w:p>
@@ -3288,7 +3562,7 @@
           <w:sz w:val="18"/>
           <w:szCs w:val="18"/>
         </w:rPr>
-        <w:t xml:space="preserve">Rahul prepares: Use ‘append-only audit event’ if a technical examiner asks why the form locks. Do not describe a referral as a regulatory filing.</w:t>
+        <w:t xml:space="preserve">Rahul prepares: Keep the explanation short; the detailed retrieval logic was already covered on the previous slide.</w:t>
       </w:r>
     </w:p>
     <w:p>
@@ -3305,7 +3579,7 @@
           <w:sz w:val="24"/>
           <w:szCs w:val="24"/>
         </w:rPr>
-        <w:t xml:space="preserve">12. Analytics — 1:00</w:t>
+        <w:t xml:space="preserve">12. Human decisions and Compliance — 1:00</w:t>
       </w:r>
     </w:p>
     <w:p>
@@ -3321,7 +3595,7 @@
           <w:sz w:val="19"/>
           <w:szCs w:val="19"/>
         </w:rPr>
-        <w:t xml:space="preserve">Pankaj says: “The Analytics page uses clearly named measures. Severity charts count stored labels. Status charts count the latest workflow state. High-severity share is a percentage within a typology. Monthly records describe fictional source dates, and decision charts count saved human events. These are descriptive charts—not a prediction of crime, a staff productivity score, or a model-accuracy measure.”</w:t>
+        <w:t xml:space="preserve">Pankaj says: “A decision becomes an accountable audit event only when a named investigator selects an allowed action and records a rationale. The completed form becomes a recorded state rather than being silently editable. Compliance is a separate human review. It can acknowledge with no further action, return the case for more information, or record an onward referral. Each result maps to a distinct queue state and audit history. The tool does not file externally.”</w:t>
       </w:r>
     </w:p>
     <w:p>
@@ -3337,7 +3611,7 @@
           <w:sz w:val="18"/>
           <w:szCs w:val="18"/>
         </w:rPr>
-        <w:t xml:space="preserve">Pointer and pacing: Point to the title and axes of the chart currently being mentioned; never point at an unrelated plot.</w:t>
+        <w:t xml:space="preserve">Pointer and pacing: Point first to Investigator, then Compliance Officer, then the no-automation statement.</w:t>
       </w:r>
     </w:p>
     <w:p>
@@ -3353,7 +3627,7 @@
           <w:sz w:val="18"/>
           <w:szCs w:val="18"/>
         </w:rPr>
-        <w:t xml:space="preserve">Rahul prepares: Read both axis labels before interpreting a chart. If a graph has a small sample, say it is a count in the fictional dataset.</w:t>
+        <w:t xml:space="preserve">Rahul prepares: Use ‘append-only audit event’ if a technical examiner asks why the form locks. Do not describe a referral as a regulatory filing.</w:t>
       </w:r>
     </w:p>
     <w:p>
@@ -3370,7 +3644,7 @@
           <w:sz w:val="24"/>
           <w:szCs w:val="24"/>
         </w:rPr>
-        <w:t xml:space="preserve">13. Context and ownership — 0:40</w:t>
+        <w:t xml:space="preserve">13. Analytics — 0:55</w:t>
       </w:r>
     </w:p>
     <w:p>
@@ -3386,7 +3660,7 @@
           <w:sz w:val="19"/>
           <w:szCs w:val="19"/>
         </w:rPr>
-        <w:t xml:space="preserve">Pankaj says: “Global Search is a context-finding tool: it helps the reviewer locate a fictional customer, account, transaction, or case and return to the relevant page. The role guide explains who performs the workflow activities. A displayed role label does not authenticate a person or grant Admin permission.”</w:t>
+        <w:t xml:space="preserve">Pankaj says: “The Analytics page uses clearly named measures. Severity charts count stored labels. Status charts count the latest workflow state. High-severity share is a percentage within a typology. Monthly records describe fictional source dates, and decision charts count saved human events. These are descriptive charts—not a prediction of crime, a staff productivity score, or a model-accuracy measure.”</w:t>
       </w:r>
     </w:p>
     <w:p>
@@ -3402,7 +3676,7 @@
           <w:sz w:val="18"/>
           <w:szCs w:val="18"/>
         </w:rPr>
-        <w:t xml:space="preserve">Pointer and pacing: Point to Global Search on the left and the Role guide on the right, one after the other.</w:t>
+        <w:t xml:space="preserve">Pointer and pacing: Point to the title and axes of the chart currently being mentioned; never point at an unrelated plot.</w:t>
       </w:r>
     </w:p>
     <w:p>
@@ -3418,7 +3692,7 @@
           <w:sz w:val="18"/>
           <w:szCs w:val="18"/>
         </w:rPr>
-        <w:t xml:space="preserve">Rahul prepares: Keep the two concepts distinct: search finds context; roles clarify responsibilities.</w:t>
+        <w:t xml:space="preserve">Rahul prepares: Read both axis labels before interpreting a chart. If a graph has a small sample, say it is a count in the fictional dataset.</w:t>
       </w:r>
     </w:p>
     <w:p>
@@ -3435,7 +3709,7 @@
           <w:sz w:val="24"/>
           <w:szCs w:val="24"/>
         </w:rPr>
-        <w:t xml:space="preserve">14. Technical architecture and code logic — 1:20</w:t>
+        <w:t xml:space="preserve">14. Context and ownership — 0:35</w:t>
       </w:r>
     </w:p>
     <w:p>
@@ -3451,7 +3725,7 @@
           <w:sz w:val="19"/>
           <w:szCs w:val="19"/>
         </w:rPr>
-        <w:t xml:space="preserve">Pankaj says: “Technically, Streamlit routes each left-navigation selection to a page module. Each page reads the active case context and renders the appropriate queue, report, evidence, or Compliance interface. SQLite stores fictional alerts, sources, chunks, and audit events. FTS5 and BM25 retrieve reviewable passages, while deterministic checks calculate evidence confidence. The key flow is route to active case, then local storage and search, then cited report, then an append-only human audit event. The product favors inspectable logic instead of hidden autonomous behavior.”</w:t>
+        <w:t xml:space="preserve">Pankaj says: “Global Search is a context-finding tool: it helps the reviewer locate a fictional customer, account, transaction, or case and return to the relevant page. The role guide explains who performs the workflow activities. A displayed role label does not authenticate a person or grant Admin permission.”</w:t>
       </w:r>
     </w:p>
     <w:p>
@@ -3467,7 +3741,7 @@
           <w:sz w:val="18"/>
           <w:szCs w:val="18"/>
         </w:rPr>
-        <w:t xml:space="preserve">Pointer and pacing: Move across the six architecture cards from top left to bottom right; finish on the code-flow line.</w:t>
+        <w:t xml:space="preserve">Pointer and pacing: Point to Global Search on the left and the Role guide on the right, one after the other.</w:t>
       </w:r>
     </w:p>
     <w:p>
@@ -3483,7 +3757,7 @@
           <w:sz w:val="18"/>
           <w:szCs w:val="18"/>
         </w:rPr>
-        <w:t xml:space="preserve">Rahul prepares: Rahul Chainani should be ready for technical questions on file structure, local SQLite, the FTS5 index, and Railway deployment after the talk.</w:t>
+        <w:t xml:space="preserve">Rahul prepares: Keep the two concepts distinct: search finds context; roles clarify responsibilities.</w:t>
       </w:r>
     </w:p>
     <w:p>
@@ -3500,7 +3774,7 @@
           <w:sz w:val="24"/>
           <w:szCs w:val="24"/>
         </w:rPr>
-        <w:t xml:space="preserve">15. Protected administration — 0:40</w:t>
+        <w:t xml:space="preserve">15. Technical architecture and code logic — 1:10</w:t>
       </w:r>
     </w:p>
     <w:p>
@@ -3516,7 +3790,7 @@
           <w:sz w:val="19"/>
           <w:szCs w:val="19"/>
         </w:rPr>
-        <w:t xml:space="preserve">Pankaj says: “Administration is visibly separated from normal case review. Knowledge Base and Rule Config support inspection of source material and fictional rule settings behind a masked passcode. We do not reveal or automate that passcode. The point is to make a boundary visible in this learning environment, not to claim production authentication.”</w:t>
+        <w:t xml:space="preserve">Pankaj says: “Technically, Streamlit routes each left-navigation selection to a page module. Each page reads the active case context and renders the appropriate queue, report, evidence, or Compliance interface. SQLite stores fictional alerts, sources, chunks, and audit events. FTS5 and BM25 retrieve reviewable passages, while deterministic checks calculate evidence confidence. The key flow is route to active case, then local storage and search, then cited report, then an append-only human audit event. The product favors inspectable logic instead of hidden autonomous behavior.”</w:t>
       </w:r>
     </w:p>
     <w:p>
@@ -3532,7 +3806,7 @@
           <w:sz w:val="18"/>
           <w:szCs w:val="18"/>
         </w:rPr>
-        <w:t xml:space="preserve">Pointer and pacing: Point only to the locked screen and its explanatory text.</w:t>
+        <w:t xml:space="preserve">Pointer and pacing: Move across the six architecture cards from top left to bottom right; finish on the code-flow line.</w:t>
       </w:r>
     </w:p>
     <w:p>
@@ -3548,7 +3822,7 @@
           <w:sz w:val="18"/>
           <w:szCs w:val="18"/>
         </w:rPr>
-        <w:t xml:space="preserve">Rahul prepares: Never type or speak the passcode during a demo.</w:t>
+        <w:t xml:space="preserve">Rahul prepares: Rahul Chainani should be ready for technical questions on file structure, local SQLite, the FTS5 index, and Railway deployment after the talk.</w:t>
       </w:r>
     </w:p>
     <w:p>
@@ -3565,7 +3839,7 @@
           <w:sz w:val="24"/>
           <w:szCs w:val="24"/>
         </w:rPr>
-        <w:t xml:space="preserve">16. Validation and deployment — 0:45</w:t>
+        <w:t xml:space="preserve">16. Protected administration — 0:35</w:t>
       </w:r>
     </w:p>
     <w:p>
@@ -3581,7 +3855,7 @@
           <w:sz w:val="19"/>
           <w:szCs w:val="19"/>
         </w:rPr>
-        <w:t xml:space="preserve">Pankaj says: “Our release path starts with exercising the changed screen locally. We protect the workflow by avoiding real decision creation during a demo, run visual checks for contrast, tooltips, tables, and charts, then commit intended files, push the main branch, and verify the Railway deployment by visiting the affected page. This makes the demonstration reproducible as well as presentable.”</w:t>
+        <w:t xml:space="preserve">Pankaj says: “Administration is visibly separated from normal case review. Knowledge Base and Rule Config support inspection of source material and fictional rule settings behind a masked passcode. We do not reveal or automate that passcode. The point is to make a boundary visible in this learning environment, not to claim production authentication.”</w:t>
       </w:r>
     </w:p>
     <w:p>
@@ -3597,7 +3871,7 @@
           <w:sz w:val="18"/>
           <w:szCs w:val="18"/>
         </w:rPr>
-        <w:t xml:space="preserve">Pointer and pacing: Point to each numbered validation card clockwise, then the final release statement.</w:t>
+        <w:t xml:space="preserve">Pointer and pacing: Point only to the locked screen and its explanatory text.</w:t>
       </w:r>
     </w:p>
     <w:p>
@@ -3613,7 +3887,7 @@
           <w:sz w:val="18"/>
           <w:szCs w:val="18"/>
         </w:rPr>
-        <w:t xml:space="preserve">Rahul prepares: Do not claim a build log alone proves release success; say the live page is checked after deployment.</w:t>
+        <w:t xml:space="preserve">Rahul prepares: Never type or speak the passcode during a demo.</w:t>
       </w:r>
     </w:p>
     <w:p>
@@ -3630,7 +3904,137 @@
           <w:sz w:val="24"/>
           <w:szCs w:val="24"/>
         </w:rPr>
-        <w:t xml:space="preserve">17. Closing — 0:25</w:t>
+        <w:t xml:space="preserve">17. Validation and deployment — 0:45</w:t>
+      </w:r>
+    </w:p>
+    <w:p>
+      <w:pPr>
+        <w:spacing w:after="80" w:before="0" w:line="276"/>
+      </w:pPr>
+      <w:r>
+        <w:rPr>
+          <w:rFonts w:ascii="Arial" w:cs="Arial" w:eastAsia="Arial" w:hAnsi="Arial"/>
+          <w:b w:val="false"/>
+          <w:bCs w:val="false"/>
+          <w:color w:val="12233F"/>
+          <w:sz w:val="19"/>
+          <w:szCs w:val="19"/>
+        </w:rPr>
+        <w:t xml:space="preserve">Pankaj says: “Our release path starts with exercising the changed screen locally. We protect the workflow by avoiding real decision creation during a demo, run visual checks for contrast, tooltips, tables, and charts, then commit intended files, push the main branch, and verify the Railway deployment by visiting the affected page. This makes the demonstration reproducible as well as presentable.”</w:t>
+      </w:r>
+    </w:p>
+    <w:p>
+      <w:pPr>
+        <w:spacing w:after="60" w:before="0" w:line="276"/>
+      </w:pPr>
+      <w:r>
+        <w:rPr>
+          <w:rFonts w:ascii="Arial" w:cs="Arial" w:eastAsia="Arial" w:hAnsi="Arial"/>
+          <w:b/>
+          <w:bCs/>
+          <w:color w:val="00A79D"/>
+          <w:sz w:val="18"/>
+          <w:szCs w:val="18"/>
+        </w:rPr>
+        <w:t xml:space="preserve">Pointer and pacing: Point to each numbered validation card clockwise, then the final release statement.</w:t>
+      </w:r>
+    </w:p>
+    <w:p>
+      <w:pPr>
+        <w:spacing w:after="130" w:before="0" w:line="276"/>
+      </w:pPr>
+      <w:r>
+        <w:rPr>
+          <w:rFonts w:ascii="Arial" w:cs="Arial" w:eastAsia="Arial" w:hAnsi="Arial"/>
+          <w:b w:val="false"/>
+          <w:bCs w:val="false"/>
+          <w:color w:val="63738D"/>
+          <w:sz w:val="18"/>
+          <w:szCs w:val="18"/>
+        </w:rPr>
+        <w:t xml:space="preserve">Rahul prepares: Do not claim a build log alone proves release success; say the live page is checked after deployment.</w:t>
+      </w:r>
+    </w:p>
+    <w:p>
+      <w:pPr>
+        <w:pStyle w:val="Heading2"/>
+        <w:spacing w:after="80" w:before="220" w:line="276"/>
+      </w:pPr>
+      <w:r>
+        <w:rPr>
+          <w:rFonts w:ascii="Arial" w:cs="Arial" w:eastAsia="Arial" w:hAnsi="Arial"/>
+          <w:b/>
+          <w:bCs/>
+          <w:color w:val="0B1F3A"/>
+          <w:sz w:val="24"/>
+          <w:szCs w:val="24"/>
+        </w:rPr>
+        <w:t xml:space="preserve">18. Value realization, ROI, and roadmap — 0:45</w:t>
+      </w:r>
+    </w:p>
+    <w:p>
+      <w:pPr>
+        <w:spacing w:after="80" w:before="0" w:line="276"/>
+      </w:pPr>
+      <w:r>
+        <w:rPr>
+          <w:rFonts w:ascii="Arial" w:cs="Arial" w:eastAsia="Arial" w:hAnsi="Arial"/>
+          <w:b w:val="false"/>
+          <w:bCs w:val="false"/>
+          <w:color w:val="12233F"/>
+          <w:sz w:val="19"/>
+          <w:szCs w:val="19"/>
+        </w:rPr>
+        <w:t xml:space="preserve">Pankaj says: “We do not claim financial ROI from fictional data. Instead, we define how a real pilot would measure value: verified time saved finding records and source passages, reduced rework, faster audit reconstruction, and fewer unsupported claims or unclear workflow states. Once a baseline and approved cost boundary exist, ROI can be calculated from verified annual benefit minus implementation and run cost. Our roadmap starts with evaluation fixtures and citation tests, adds authentication and evidence-lineage versioning, and only then considers governed ingestion and approved integrations.”</w:t>
+      </w:r>
+    </w:p>
+    <w:p>
+      <w:pPr>
+        <w:spacing w:after="60" w:before="0" w:line="276"/>
+      </w:pPr>
+      <w:r>
+        <w:rPr>
+          <w:rFonts w:ascii="Arial" w:cs="Arial" w:eastAsia="Arial" w:hAnsi="Arial"/>
+          <w:b/>
+          <w:bCs/>
+          <w:color w:val="00A79D"/>
+          <w:sz w:val="18"/>
+          <w:szCs w:val="18"/>
+        </w:rPr>
+        <w:t xml:space="preserve">Pointer and pacing: Move through the four value levers, the ROI formula, then the three future steps at the bottom.</w:t>
+      </w:r>
+    </w:p>
+    <w:p>
+      <w:pPr>
+        <w:spacing w:after="130" w:before="0" w:line="276"/>
+      </w:pPr>
+      <w:r>
+        <w:rPr>
+          <w:rFonts w:ascii="Arial" w:cs="Arial" w:eastAsia="Arial" w:hAnsi="Arial"/>
+          <w:b w:val="false"/>
+          <w:bCs w:val="false"/>
+          <w:color w:val="63738D"/>
+          <w:sz w:val="18"/>
+          <w:szCs w:val="18"/>
+        </w:rPr>
+        <w:t xml:space="preserve">Rahul prepares: Call the formula a planning model, not a current result. If asked for a number, explain that it requires pilot baseline data and approved cost assumptions.</w:t>
+      </w:r>
+    </w:p>
+    <w:p>
+      <w:pPr>
+        <w:pStyle w:val="Heading2"/>
+        <w:spacing w:after="80" w:before="220" w:line="276"/>
+      </w:pPr>
+      <w:r>
+        <w:rPr>
+          <w:rFonts w:ascii="Arial" w:cs="Arial" w:eastAsia="Arial" w:hAnsi="Arial"/>
+          <w:b/>
+          <w:bCs/>
+          <w:color w:val="0B1F3A"/>
+          <w:sz w:val="24"/>
+          <w:szCs w:val="24"/>
+        </w:rPr>
+        <w:t xml:space="preserve">19. Closing — 0:30</w:t>
       </w:r>
     </w:p>
     <w:p>

</xml_diff>